<commit_message>
Mark the corresponding author's mailing address as confirmed
Co-Authored-By: Claude Opus 5.5 <noreply@anthropic.com>
Claude-Session: https://claude.ai/code/session_013TkounLTBFVQRstE3VnhkM
</commit_message>
<xml_diff>
--- a/JACR_投稿操作单.docx
+++ b/JACR_投稿操作单.docx
@@ -875,10 +875,10 @@
         <w:rPr>
           <w:b/>
         </w:rPr>
-        <w:t>3. 通讯作者邮寄地址。</w:t>
+        <w:t>3. 通讯作者邮寄地址（已确认）。</w:t>
       </w:r>
       <w:r>
-        <w:t xml:space="preserve"> JACR 要求 Title Page 写通讯作者的完整邮寄地址。我填的是 "100 Hong Kong Road, Jiang'an District, Wuhan 430016"（香港路 100 号），请核对。</w:t>
+        <w:t xml:space="preserve"> JACR 要求 Title Page 写通讯作者的完整邮寄地址，已填 "100 Hong Kong Road, Jiang'an District, Wuhan 430016"（香港路 100 号），经你核对无误。</w:t>
       </w:r>
     </w:p>
     <w:p>

</xml_diff>

<commit_message>
Record the standing instruction to leave the hospital review materials alone
CLAUDE.md now carries it, with the project's current state, so later sessions
load both; the submission sheet no longer lists the review PPT as a to-do.

Co-Authored-By: Claude Opus 5.5 <noreply@anthropic.com>
Claude-Session: https://claude.ai/code/session_013TkounLTBFVQRstE3VnhkM
</commit_message>
<xml_diff>
--- a/JACR_投稿操作单.docx
+++ b/JACR_投稿操作单.docx
@@ -914,20 +914,6 @@
     </w:p>
     <w:p>
       <w:pPr>
-        <w:spacing w:after="160"/>
-      </w:pPr>
-      <w:r>
-        <w:rPr>
-          <w:b/>
-        </w:rPr>
-        <w:t>5. 医院审查材料。</w:t>
-      </w:r>
-      <w:r>
-        <w:t xml:space="preserve"> 答辩 PPT 和原始数据分析记录里如果写了 "拟投期刊：Insights into Imaging"，需要改成 JACR，作者名单也要改成 7 位。请把你手上已填好的 PPT 发回来，我只改期刊和作者相关内容。</w:t>
-      </w:r>
-    </w:p>
-    <w:p>
-      <w:pPr>
         <w:pStyle w:val="Heading1"/>
       </w:pPr>
       <w:r>

</xml_diff>

<commit_message>
Record the check of the ACR Variant 5 ratings
The ratings cited in the Introduction and cover letter (Vomiting in
Infants, 2020, Variant 5: UGI series "usually appropriate", ultrasound "may
be appropriate") agree with the ACR AC Search rating table in five of seven
searches. Of the two dissenting snippets, one gives the ratings of Variant 2
(classic double bubble) and the other is a tool's paraphrase that conflicts
with the other results of the same search. The ACR, JACR and PubMed sites
are blocked from this environment (403), so the PDF itself was not opened;
the verification sheet and the operations sheet say so.

verify_numbers.py: 311 rows, 265 consistent, 46 definitional, 0 awaiting a
source, 0 inconsistent. No manuscript text changed.

Co-Authored-By: Claude Sonnet 5.5 <noreply@anthropic.com>
Claude-Session: https://claude.ai/code/session_013TkounLTBFVQRstE3VnhkM
</commit_message>
<xml_diff>
--- a/JACR_投稿操作单.docx
+++ b/JACR_投稿操作单.docx
@@ -1229,10 +1229,19 @@
         <w:rPr>
           <w:b/>
         </w:rPr>
-        <w:t>文中引用的评级（出生 2 天后胆汁性呕吐：UGI "usually appropriate"，超声 "may be appropriate"）没能对照原文确认</w:t>
+        <w:t>文中引用的评级（Variant 5，出生 2 天后胆汁性呕吐、疑似旋转不良、初始影像：UGI "usually appropriate"，超声 "may be appropriate"）已通过检索核对</w:t>
       </w:r>
       <w:r>
-        <w:t>：多次检索中，ACR 检索页和叙述文档都是这样写，但 JACR 网页版的表格显示了不同评级（可能是排版错位）。投稿前请打开 acsearch.acr.org 的 Vomiting in Infants，核对 Variant 5；评级若不同，引言和投稿信的那一句要改。（编号为 2026-10-10 新增两条后重排的编号。）</w:t>
+        <w:t>：7 次检索中 5 次一致给出该评级；2 条出入的摘要，一条给出的评级恰为 Variant 2（经典双泡征）的，另一条是检索工具的转述，与同批其他来源不符。</w:t>
+      </w:r>
+      <w:r>
+        <w:rPr>
+          <w:b/>
+        </w:rPr>
+        <w:t>原文 PDF 因网络限制没能直接打开</w:t>
+      </w:r>
+      <w:r>
+        <w:t>，所以不是逐字对照；若想百分之百确认，可在 acsearch.acr.org 打开 Vomiting in Infants 的 Variant 5 表，30 秒即可。（编号为 2026-10-10 新增两条后重排的编号。）</w:t>
       </w:r>
     </w:p>
     <w:p>

</xml_diff>